<commit_message>
infra: EIP 제거 + 오리진 주차로 dangling origin 차단
EIP(52.79.191.28)를 제거하고 퍼블릭 IP를 subnet auto-assign에 맡긴다.

제거하면서 드러난 문제: EIP를 놓으면 IP가 AWS 풀로 반납되어 다른 고객에게
배정될 수 있는데, CloudFront 오리진은 ec2-<IP>.compute.amazonaws.com 형태고
이 이름은 규칙상 항상 그 IP로 resolve된다. 즉 EC2 정지 중 /api/* 요청이 그 IP를
새로 받은 제3자에게 전달된다(Authorization 헤더 포함). 07-15 이전의 하드코딩
dynamic IP 구성에도 있던 구멍으로, EIP가 우연히 막고 있었을 뿐이다.

그래서 오리진 주소를 var.backend_origin_dns로 분리하고, 비우면(기본값=EC2 정지)
우리가 소유한 S3 도메인으로 '주차'한다. 8000 포트가 없어 연결이 실패 = fail closed.
주차 주소가 항상 유효하므로 EC2를 켜지 않고도 apply가 된다.

운영: 켤 때 -var="backend_origin_dns=<EC2 퍼블릭 DNS>", 끌 때는 그냥 apply(주차).

라이브검증: EIP 0개, EC2 퍼블릭 IP None, 프론트 200, /api/status 504(fail closed).

문서: 07-15에 적은 "EIP는 붙어있는 동안 무료"는 2024-02 이전 기준이라 정정
(모든 퍼블릭 IPv4가 시간당 과금, 정지된 인스턴스에 붙은 EIP도 과금).
PROGRESS.md에 07-17 항목 추가 + 07-15 항목에 되돌림 표시.

Co-Authored-By: Claude Opus 4.8 <noreply@anthropic.com>
Claude-Session: https://claude.ai/code/session_01PtEMsPULC9bDpf9q48w2yL
</commit_message>
<xml_diff>
--- a/블로그_개발일지_2026-07-15.docx
+++ b/블로그_개발일지_2026-07-15.docx
@@ -173,7 +173,22 @@
         <w:rPr>
           <w:color w:val="1E7E34"/>
         </w:rPr>
-        <w:t>EIP는 인스턴스에 '붙어 있는 동안'은 무료고, 붙이지 않고 놀리면 오히려 요금이 붙는다(희소자원이라 방치를 막으려는 과금). 그리고 인프라 설정에서 주소를 하드코딩하지 말고 '리소스 참조'로 쓰면, 값이 바뀌어도 코드가 알아서 따라간다 — 이게 IaC(코드로 인프라 관리)의 핵심 이득이다.</w:t>
+        <w:t>인프라 설정에서 주소를 하드코딩하지 말고 '리소스 참조'로 쓰면, 값이 바뀌어도 코드가 알아서 따라간다 — 이게 IaC(코드로 인프라 관리)의 핵심 이득이다.</w:t>
+      </w:r>
+    </w:p>
+    <w:p>
+      <w:pPr>
+        <w:ind w:left="240"/>
+      </w:pPr>
+      <w:r>
+        <w:rPr>
+          <w:b/>
+          <w:color w:val="C0392B"/>
+        </w:rPr>
+        <w:t xml:space="preserve">[2026-07-17 추가] 이 결정은 이틀 뒤 되돌렸다  </w:t>
+      </w:r>
+      <w:r>
+        <w:t>① 요금: 2024년 2월부터 '모든 퍼블릭 IPv4'가 시간당 $0.005다. 즉 EIP를 써도 안 써도 켜져 있는 동안 값은 같고(프리티어 12개월은 월 750시간 무료라 지금은 $0), EIP는 '정지된 인스턴스에 붙어 있으면' 과금된다. ② 그래서 EIP를 뺐는데, 빼는 과정에서 더 중요한 걸 발견했다 — IP를 놓으면 그 주소는 남에게 배정되고, 오리진에 남은 옛 호스트명이 그 남의 서버를 가리키게 된다(dangling origin). 자세한 건 2026-07-17 일지 참고.</w:t>
       </w:r>
     </w:p>
     <w:p>

</xml_diff>